<commit_message>
2.3: CaCO3 tablosu notu ogrenci cumlesine cevrildi (cevap vermiyor); heterojen denge ornegi Fe2O3 yerine CO2(g) + H2O(s) = H2CO3(suda) yapildi, Gorsel C gaz-sivi olarak yeniden cizildi; NOT paragraflari sari vurgulandi
</commit_message>
<xml_diff>
--- a/Kim11-2-13-Cozunurluk-Carpimi.docx
+++ b/Kim11-2-13-Cozunurluk-Carpimi.docx
@@ -8228,6 +8228,7 @@
       <w:r>
         <w:rPr>
           <w:rFonts w:ascii="Times New Roman" w:hAnsi="Times New Roman" w:cs="Times New Roman"/>
+          <w:highlight w:val="yellow"/>
           <w:lang w:val="tr-TR"/>
         </w:rPr>
         <w:t xml:space="preserve">NOT: K</w:t>
@@ -8236,6 +8237,7 @@
         <w:rPr>
           <w:rFonts w:ascii="Times New Roman" w:hAnsi="Times New Roman" w:cs="Times New Roman"/>
           <w:lang w:val="tr-TR"/>
+          <w:highlight w:val="yellow"/>
           <w:vertAlign w:val="subscript"/>
         </w:rPr>
         <w:t xml:space="preserve">çç</w:t>
@@ -8243,6 +8245,7 @@
       <w:r>
         <w:rPr>
           <w:rFonts w:ascii="Times New Roman" w:hAnsi="Times New Roman" w:cs="Times New Roman"/>
+          <w:highlight w:val="yellow"/>
           <w:lang w:val="tr-TR"/>
         </w:rPr>
         <w:t xml:space="preserve"> değerleri genel kimya ders kitaplarında (Petrucci vb.) 25 °C için verilen değerlerdir; yayın öncesi Petrucci ek tablosu ile karşılaştırılması önerilir. Bilgi metnindeki AgI (8,5·10</w:t>
@@ -8251,6 +8254,7 @@
         <w:rPr>
           <w:rFonts w:ascii="Times New Roman" w:hAnsi="Times New Roman" w:cs="Times New Roman"/>
           <w:lang w:val="tr-TR"/>
+          <w:highlight w:val="yellow"/>
           <w:vertAlign w:val="superscript"/>
         </w:rPr>
         <w:t xml:space="preserve">-17</w:t>
@@ -8258,6 +8262,7 @@
       <w:r>
         <w:rPr>
           <w:rFonts w:ascii="Times New Roman" w:hAnsi="Times New Roman" w:cs="Times New Roman"/>
+          <w:highlight w:val="yellow"/>
           <w:lang w:val="tr-TR"/>
         </w:rPr>
         <w:t xml:space="preserve">), BaCO</w:t>
@@ -8266,6 +8271,7 @@
         <w:rPr>
           <w:rFonts w:ascii="Times New Roman" w:hAnsi="Times New Roman" w:cs="Times New Roman"/>
           <w:lang w:val="tr-TR"/>
+          <w:highlight w:val="yellow"/>
           <w:vertAlign w:val="subscript"/>
         </w:rPr>
         <w:t xml:space="preserve">3</w:t>
@@ -8273,6 +8279,7 @@
       <w:r>
         <w:rPr>
           <w:rFonts w:ascii="Times New Roman" w:hAnsi="Times New Roman" w:cs="Times New Roman"/>
+          <w:highlight w:val="yellow"/>
           <w:lang w:val="tr-TR"/>
         </w:rPr>
         <w:t xml:space="preserve"> (5,1·10</w:t>
@@ -8281,6 +8288,7 @@
         <w:rPr>
           <w:rFonts w:ascii="Times New Roman" w:hAnsi="Times New Roman" w:cs="Times New Roman"/>
           <w:lang w:val="tr-TR"/>
+          <w:highlight w:val="yellow"/>
           <w:vertAlign w:val="superscript"/>
         </w:rPr>
         <w:t xml:space="preserve">-9</w:t>
@@ -8288,6 +8296,7 @@
       <w:r>
         <w:rPr>
           <w:rFonts w:ascii="Times New Roman" w:hAnsi="Times New Roman" w:cs="Times New Roman"/>
+          <w:highlight w:val="yellow"/>
           <w:lang w:val="tr-TR"/>
         </w:rPr>
         <w:t xml:space="preserve">) ve CaF</w:t>
@@ -8296,6 +8305,7 @@
         <w:rPr>
           <w:rFonts w:ascii="Times New Roman" w:hAnsi="Times New Roman" w:cs="Times New Roman"/>
           <w:lang w:val="tr-TR"/>
+          <w:highlight w:val="yellow"/>
           <w:vertAlign w:val="subscript"/>
         </w:rPr>
         <w:t xml:space="preserve">2</w:t>
@@ -8303,6 +8313,7 @@
       <w:r>
         <w:rPr>
           <w:rFonts w:ascii="Times New Roman" w:hAnsi="Times New Roman" w:cs="Times New Roman"/>
+          <w:highlight w:val="yellow"/>
           <w:lang w:val="tr-TR"/>
         </w:rPr>
         <w:t xml:space="preserve"> (3,9·10</w:t>
@@ -8311,6 +8322,7 @@
         <w:rPr>
           <w:rFonts w:ascii="Times New Roman" w:hAnsi="Times New Roman" w:cs="Times New Roman"/>
           <w:lang w:val="tr-TR"/>
+          <w:highlight w:val="yellow"/>
           <w:vertAlign w:val="superscript"/>
         </w:rPr>
         <w:t xml:space="preserve">-11</w:t>
@@ -8318,6 +8330,7 @@
       <w:r>
         <w:rPr>
           <w:rFonts w:ascii="Times New Roman" w:hAnsi="Times New Roman" w:cs="Times New Roman"/>
+          <w:highlight w:val="yellow"/>
           <w:lang w:val="tr-TR"/>
         </w:rPr>
         <w:t xml:space="preserve">) değerleri de aynı tür tablolardan alınmıştır; özellikle CaF</w:t>
@@ -8326,6 +8339,7 @@
         <w:rPr>
           <w:rFonts w:ascii="Times New Roman" w:hAnsi="Times New Roman" w:cs="Times New Roman"/>
           <w:lang w:val="tr-TR"/>
+          <w:highlight w:val="yellow"/>
           <w:vertAlign w:val="subscript"/>
         </w:rPr>
         <w:t xml:space="preserve">2</w:t>
@@ -8333,6 +8347,7 @@
       <w:r>
         <w:rPr>
           <w:rFonts w:ascii="Times New Roman" w:hAnsi="Times New Roman" w:cs="Times New Roman"/>
+          <w:highlight w:val="yellow"/>
           <w:lang w:val="tr-TR"/>
         </w:rPr>
         <w:t xml:space="preserve"> için kaynaklarda farklı değerler verildiğinden yayın öncesi kontrol edilmelidir. PbCl</w:t>
@@ -8341,6 +8356,7 @@
         <w:rPr>
           <w:rFonts w:ascii="Times New Roman" w:hAnsi="Times New Roman" w:cs="Times New Roman"/>
           <w:lang w:val="tr-TR"/>
+          <w:highlight w:val="yellow"/>
           <w:vertAlign w:val="subscript"/>
         </w:rPr>
         <w:t xml:space="preserve">2</w:t>
@@ -8348,6 +8364,7 @@
       <w:r>
         <w:rPr>
           <w:rFonts w:ascii="Times New Roman" w:hAnsi="Times New Roman" w:cs="Times New Roman"/>
+          <w:highlight w:val="yellow"/>
           <w:lang w:val="tr-TR"/>
         </w:rPr>
         <w:t xml:space="preserve"> ve X</w:t>
@@ -8356,6 +8373,7 @@
         <w:rPr>
           <w:rFonts w:ascii="Times New Roman" w:hAnsi="Times New Roman" w:cs="Times New Roman"/>
           <w:lang w:val="tr-TR"/>
+          <w:highlight w:val="yellow"/>
           <w:vertAlign w:val="subscript"/>
         </w:rPr>
         <w:t xml:space="preserve">2</w:t>
@@ -8363,6 +8381,7 @@
       <w:r>
         <w:rPr>
           <w:rFonts w:ascii="Times New Roman" w:hAnsi="Times New Roman" w:cs="Times New Roman"/>
+          <w:highlight w:val="yellow"/>
           <w:lang w:val="tr-TR"/>
         </w:rPr>
         <w:t xml:space="preserve">Y sorularındaki çözünürlük değerleri öğretim amaçlıdır.</w:t>

</xml_diff>

<commit_message>
Kim11-2-13-Cozunurluk-Carpimi: gorsel alanlarina Shutter onizlemeleri yerlestirildi (2.3 bicimi)
</commit_message>
<xml_diff>
--- a/Kim11-2-13-Cozunurluk-Carpimi.docx
+++ b/Kim11-2-13-Cozunurluk-Carpimi.docx
@@ -22,85 +22,59 @@
         <w:t xml:space="preserve">BÖLÜM: Çözünürlük Dengesi</w:t>
       </w:r>
     </w:p>
-    <w:tbl>
-      <w:tblPr>
-        <w:tblW w:w="9000" w:type="dxa"/>
+    <w:p>
+      <w:pPr>
         <w:jc w:val="center"/>
-        <w:tblBorders>
-          <w:top w:val="single" w:sz="8" w:space="0" w:color="7F7F7F"/>
-          <w:left w:val="single" w:sz="8" w:space="0" w:color="7F7F7F"/>
-          <w:bottom w:val="single" w:sz="8" w:space="0" w:color="7F7F7F"/>
-          <w:right w:val="single" w:sz="8" w:space="0" w:color="7F7F7F"/>
-        </w:tblBorders>
-      </w:tblPr>
-      <w:tblGrid>
-        <w:gridCol w:w="9000"/>
-      </w:tblGrid>
-      <w:tr>
-        <w:tc>
-          <w:tcPr>
-            <w:tcW w:w="9000" w:type="dxa"/>
-            <w:shd w:val="clear" w:color="auto" w:fill="EDEDED"/>
-          </w:tcPr>
-          <w:p>
-            <w:pPr>
-              <w:jc w:val="both"/>
-              <w:rPr>
-                <w:rFonts w:ascii="Times New Roman" w:hAnsi="Times New Roman" w:cs="Times New Roman"/>
-                <w:lang w:val="tr-TR"/>
-              </w:rPr>
-            </w:pPr>
-            <w:r>
-              <w:rPr>
-                <w:rFonts w:ascii="Times New Roman" w:hAnsi="Times New Roman" w:cs="Times New Roman"/>
-                <w:lang w:val="tr-TR"/>
-              </w:rPr>
-              <w:t xml:space="preserve">GÖRSEL ALANI (Bölüm kapağı, tam sayfa; Shutterstock)</w:t>
-            </w:r>
-          </w:p>
-          <w:p>
-            <w:pPr>
-              <w:jc w:val="both"/>
-              <w:rPr>
-                <w:rFonts w:ascii="Times New Roman" w:hAnsi="Times New Roman" w:cs="Times New Roman"/>
-                <w:lang w:val="tr-TR"/>
-              </w:rPr>
-            </w:pPr>
-            <w:r>
-              <w:rPr>
-                <w:rFonts w:ascii="Times New Roman" w:hAnsi="Times New Roman" w:cs="Times New Roman"/>
-                <w:lang w:val="tr-TR"/>
-              </w:rPr>
-              <w:t xml:space="preserve">Tarif: Su altında kalsiyum karbonattan oluşmuş mercan resifi ve deniz kabukları ya da bir mağaradaki damlataş oluşumları (tam sayfa bölüm kapağı).</w:t>
-            </w:r>
-          </w:p>
-          <w:p>
-            <w:pPr>
-              <w:jc w:val="both"/>
-              <w:rPr>
-                <w:rFonts w:ascii="Times New Roman" w:hAnsi="Times New Roman" w:cs="Times New Roman"/>
-                <w:lang w:val="tr-TR"/>
-              </w:rPr>
-            </w:pPr>
-            <w:r>
-              <w:rPr>
-                <w:rFonts w:ascii="Times New Roman" w:hAnsi="Times New Roman" w:cs="Times New Roman"/>
-                <w:lang w:val="tr-TR"/>
-              </w:rPr>
-              <w:t xml:space="preserve">Shutter ID: 2760185255 (fotoğraf) — School of fish over a coral reef, blue tones</w:t>
-            </w:r>
-          </w:p>
-        </w:tc>
-      </w:tr>
-    </w:tbl>
+      </w:pPr>
+      <w:r>
+        <w:drawing>
+          <wp:inline xmlns:a="http://schemas.openxmlformats.org/drawingml/2006/main" xmlns:pic="http://schemas.openxmlformats.org/drawingml/2006/picture">
+            <wp:extent cx="5400000" cy="3967200"/>
+            <wp:docPr id="900014" name="Picture 900014"/>
+            <wp:cNvGraphicFramePr>
+              <a:graphicFrameLocks noChangeAspect="1"/>
+            </wp:cNvGraphicFramePr>
+            <a:graphic>
+              <a:graphicData uri="http://schemas.openxmlformats.org/drawingml/2006/picture">
+                <pic:pic>
+                  <pic:nvPicPr>
+                    <pic:cNvPr id="0" name="2760185255_d.jpg"/>
+                    <pic:cNvPicPr/>
+                  </pic:nvPicPr>
+                  <pic:blipFill>
+                    <a:blip r:embed="rId12"/>
+                    <a:stretch>
+                      <a:fillRect/>
+                    </a:stretch>
+                  </pic:blipFill>
+                  <pic:spPr>
+                    <a:xfrm>
+                      <a:off x="0" y="0"/>
+                      <a:ext cx="5400000" cy="3967200"/>
+                    </a:xfrm>
+                    <a:prstGeom prst="rect"/>
+                  </pic:spPr>
+                </pic:pic>
+              </a:graphicData>
+            </a:graphic>
+          </wp:inline>
+        </w:drawing>
+      </w:r>
+    </w:p>
     <w:p>
       <w:pPr>
-        <w:jc w:val="both"/>
-        <w:rPr>
-          <w:rFonts w:ascii="Times New Roman" w:hAnsi="Times New Roman" w:cs="Times New Roman"/>
-          <w:lang w:val="tr-TR"/>
-        </w:rPr>
-      </w:pPr>
+        <w:jc w:val="center"/>
+      </w:pPr>
+      <w:r>
+        <w:rPr>
+          <w:rFonts w:ascii="Times New Roman" w:hAnsi="Times New Roman" w:cs="Times New Roman"/>
+          <w:b/>
+          <w:bCs/>
+          <w:highlight w:val="yellow"/>
+          <w:lang w:val="tr-TR"/>
+        </w:rPr>
+        <w:t xml:space="preserve">Shutter id: 2760185255 (bölüm kapağı, tam sayfa)</w:t>
+      </w:r>
     </w:p>
     <w:tbl>
       <w:tblPr>
@@ -125,77 +99,60 @@
           <w:tcPr>
             <w:tcW w:w="4500" w:type="dxa"/>
           </w:tcPr>
-          <w:tbl>
-            <w:tblPr>
-              <w:tblW w:w="4300" w:type="dxa"/>
+          <w:p>
+            <w:pPr>
               <w:jc w:val="center"/>
-              <w:tblBorders>
-                <w:top w:val="single" w:sz="8" w:space="0" w:color="7F7F7F"/>
-                <w:left w:val="single" w:sz="8" w:space="0" w:color="7F7F7F"/>
-                <w:bottom w:val="single" w:sz="8" w:space="0" w:color="7F7F7F"/>
-                <w:right w:val="single" w:sz="8" w:space="0" w:color="7F7F7F"/>
-              </w:tblBorders>
-            </w:tblPr>
-            <w:tblGrid>
-              <w:gridCol w:w="4300"/>
-            </w:tblGrid>
-            <w:tr>
-              <w:tc>
-                <w:tcPr>
-                  <w:tcW w:w="4300" w:type="dxa"/>
-                  <w:shd w:val="clear" w:color="auto" w:fill="EDEDED"/>
-                </w:tcPr>
-                <w:p>
-                  <w:pPr>
-                    <w:jc w:val="both"/>
-                    <w:rPr>
-                      <w:rFonts w:ascii="Times New Roman" w:hAnsi="Times New Roman" w:cs="Times New Roman"/>
-                      <w:lang w:val="tr-TR"/>
-                    </w:rPr>
-                  </w:pPr>
-                  <w:r>
-                    <w:rPr>
-                      <w:rFonts w:ascii="Times New Roman" w:hAnsi="Times New Roman" w:cs="Times New Roman"/>
-                      <w:lang w:val="tr-TR"/>
-                    </w:rPr>
-                    <w:t xml:space="preserve">GÖRSEL ALANI (Shutterstock)</w:t>
-                  </w:r>
-                </w:p>
-                <w:p>
-                  <w:pPr>
-                    <w:jc w:val="both"/>
-                    <w:rPr>
-                      <w:rFonts w:ascii="Times New Roman" w:hAnsi="Times New Roman" w:cs="Times New Roman"/>
-                      <w:lang w:val="tr-TR"/>
-                    </w:rPr>
-                  </w:pPr>
-                  <w:r>
-                    <w:rPr>
-                      <w:rFonts w:ascii="Times New Roman" w:hAnsi="Times New Roman" w:cs="Times New Roman"/>
-                      <w:lang w:val="tr-TR"/>
-                    </w:rPr>
-                    <w:t xml:space="preserve">Tarif: Pamukkale travertenleri ya da bir mağaradaki damlataşlar; suda az çözünen kalsiyum karbonatın çözünüp yeniden çökmesiyle oluşan yapılar (yurt içinden bir görüntü tercih edilmeli).</w:t>
-                  </w:r>
-                </w:p>
-                <w:p>
-                  <w:pPr>
-                    <w:jc w:val="both"/>
-                    <w:rPr>
-                      <w:rFonts w:ascii="Times New Roman" w:hAnsi="Times New Roman" w:cs="Times New Roman"/>
-                      <w:lang w:val="tr-TR"/>
-                    </w:rPr>
-                  </w:pPr>
-                  <w:r>
-                    <w:rPr>
-                      <w:rFonts w:ascii="Times New Roman" w:hAnsi="Times New Roman" w:cs="Times New Roman"/>
-                      <w:lang w:val="tr-TR"/>
-                    </w:rPr>
-                    <w:t xml:space="preserve">Shutter ID: 2813805813 (fotoğraf) — Pamukkale thermal spring and travertine terraces</w:t>
-                  </w:r>
-                </w:p>
-              </w:tc>
-            </w:tr>
-          </w:tbl>
+            </w:pPr>
+            <w:r>
+              <w:drawing>
+                <wp:inline xmlns:a="http://schemas.openxmlformats.org/drawingml/2006/main" xmlns:pic="http://schemas.openxmlformats.org/drawingml/2006/picture">
+                  <wp:extent cx="2664000" cy="1957152"/>
+                  <wp:docPr id="900015" name="Picture 900015"/>
+                  <wp:cNvGraphicFramePr>
+                    <a:graphicFrameLocks noChangeAspect="1"/>
+                  </wp:cNvGraphicFramePr>
+                  <a:graphic>
+                    <a:graphicData uri="http://schemas.openxmlformats.org/drawingml/2006/picture">
+                      <pic:pic>
+                        <pic:nvPicPr>
+                          <pic:cNvPr id="0" name="2813805813_d.jpg"/>
+                          <pic:cNvPicPr/>
+                        </pic:nvPicPr>
+                        <pic:blipFill>
+                          <a:blip r:embed="rId13"/>
+                          <a:stretch>
+                            <a:fillRect/>
+                          </a:stretch>
+                        </pic:blipFill>
+                        <pic:spPr>
+                          <a:xfrm>
+                            <a:off x="0" y="0"/>
+                            <a:ext cx="2664000" cy="1957152"/>
+                          </a:xfrm>
+                          <a:prstGeom prst="rect"/>
+                        </pic:spPr>
+                      </pic:pic>
+                    </a:graphicData>
+                  </a:graphic>
+                </wp:inline>
+              </w:drawing>
+            </w:r>
+          </w:p>
+          <w:p>
+            <w:pPr>
+              <w:jc w:val="center"/>
+            </w:pPr>
+            <w:r>
+              <w:rPr>
+                <w:rFonts w:ascii="Times New Roman" w:hAnsi="Times New Roman" w:cs="Times New Roman"/>
+                <w:b/>
+                <w:bCs/>
+                <w:highlight w:val="yellow"/>
+                <w:lang w:val="tr-TR"/>
+              </w:rPr>
+              <w:t xml:space="preserve">Shutter id: 2813805813</w:t>
+            </w:r>
+          </w:p>
           <w:p>
             <w:pPr>
               <w:jc w:val="center"/>
@@ -226,77 +183,60 @@
           <w:tcPr>
             <w:tcW w:w="4500" w:type="dxa"/>
           </w:tcPr>
-          <w:tbl>
-            <w:tblPr>
-              <w:tblW w:w="4300" w:type="dxa"/>
+          <w:p>
+            <w:pPr>
               <w:jc w:val="center"/>
-              <w:tblBorders>
-                <w:top w:val="single" w:sz="8" w:space="0" w:color="7F7F7F"/>
-                <w:left w:val="single" w:sz="8" w:space="0" w:color="7F7F7F"/>
-                <w:bottom w:val="single" w:sz="8" w:space="0" w:color="7F7F7F"/>
-                <w:right w:val="single" w:sz="8" w:space="0" w:color="7F7F7F"/>
-              </w:tblBorders>
-            </w:tblPr>
-            <w:tblGrid>
-              <w:gridCol w:w="4300"/>
-            </w:tblGrid>
-            <w:tr>
-              <w:tc>
-                <w:tcPr>
-                  <w:tcW w:w="4300" w:type="dxa"/>
-                  <w:shd w:val="clear" w:color="auto" w:fill="EDEDED"/>
-                </w:tcPr>
-                <w:p>
-                  <w:pPr>
-                    <w:jc w:val="both"/>
-                    <w:rPr>
-                      <w:rFonts w:ascii="Times New Roman" w:hAnsi="Times New Roman" w:cs="Times New Roman"/>
-                      <w:lang w:val="tr-TR"/>
-                    </w:rPr>
-                  </w:pPr>
-                  <w:r>
-                    <w:rPr>
-                      <w:rFonts w:ascii="Times New Roman" w:hAnsi="Times New Roman" w:cs="Times New Roman"/>
-                      <w:lang w:val="tr-TR"/>
-                    </w:rPr>
-                    <w:t xml:space="preserve">GÖRSEL ALANI (Shutterstock)</w:t>
-                  </w:r>
-                </w:p>
-                <w:p>
-                  <w:pPr>
-                    <w:jc w:val="both"/>
-                    <w:rPr>
-                      <w:rFonts w:ascii="Times New Roman" w:hAnsi="Times New Roman" w:cs="Times New Roman"/>
-                      <w:lang w:val="tr-TR"/>
-                    </w:rPr>
-                  </w:pPr>
-                  <w:r>
-                    <w:rPr>
-                      <w:rFonts w:ascii="Times New Roman" w:hAnsi="Times New Roman" w:cs="Times New Roman"/>
-                      <w:lang w:val="tr-TR"/>
-                    </w:rPr>
-                    <w:t xml:space="preserve">Tarif: Tokat Ballıca Mağarası’nda sarkıt ve dikitler.</w:t>
-                  </w:r>
-                </w:p>
-                <w:p>
-                  <w:pPr>
-                    <w:jc w:val="both"/>
-                    <w:rPr>
-                      <w:rFonts w:ascii="Times New Roman" w:hAnsi="Times New Roman" w:cs="Times New Roman"/>
-                      <w:lang w:val="tr-TR"/>
-                    </w:rPr>
-                  </w:pPr>
-                  <w:r>
-                    <w:rPr>
-                      <w:rFonts w:ascii="Times New Roman" w:hAnsi="Times New Roman" w:cs="Times New Roman"/>
-                      <w:lang w:val="tr-TR"/>
-                    </w:rPr>
-                    <w:t xml:space="preserve">Shutter ID: 2678640755 (fotoğraf) — Ballıca Cave in Tokat, Turkey, stalactite and stalagmite formations</w:t>
-                  </w:r>
-                </w:p>
-              </w:tc>
-            </w:tr>
-          </w:tbl>
+            </w:pPr>
+            <w:r>
+              <w:drawing>
+                <wp:inline xmlns:a="http://schemas.openxmlformats.org/drawingml/2006/main" xmlns:pic="http://schemas.openxmlformats.org/drawingml/2006/picture">
+                  <wp:extent cx="2664000" cy="1953600"/>
+                  <wp:docPr id="900016" name="Picture 900016"/>
+                  <wp:cNvGraphicFramePr>
+                    <a:graphicFrameLocks noChangeAspect="1"/>
+                  </wp:cNvGraphicFramePr>
+                  <a:graphic>
+                    <a:graphicData uri="http://schemas.openxmlformats.org/drawingml/2006/picture">
+                      <pic:pic>
+                        <pic:nvPicPr>
+                          <pic:cNvPr id="0" name="2678640755_d.jpg"/>
+                          <pic:cNvPicPr/>
+                        </pic:nvPicPr>
+                        <pic:blipFill>
+                          <a:blip r:embed="rId14"/>
+                          <a:stretch>
+                            <a:fillRect/>
+                          </a:stretch>
+                        </pic:blipFill>
+                        <pic:spPr>
+                          <a:xfrm>
+                            <a:off x="0" y="0"/>
+                            <a:ext cx="2664000" cy="1953600"/>
+                          </a:xfrm>
+                          <a:prstGeom prst="rect"/>
+                        </pic:spPr>
+                      </pic:pic>
+                    </a:graphicData>
+                  </a:graphic>
+                </wp:inline>
+              </w:drawing>
+            </w:r>
+          </w:p>
+          <w:p>
+            <w:pPr>
+              <w:jc w:val="center"/>
+            </w:pPr>
+            <w:r>
+              <w:rPr>
+                <w:rFonts w:ascii="Times New Roman" w:hAnsi="Times New Roman" w:cs="Times New Roman"/>
+                <w:b/>
+                <w:bCs/>
+                <w:highlight w:val="yellow"/>
+                <w:lang w:val="tr-TR"/>
+              </w:rPr>
+              <w:t xml:space="preserve">Shutter id: 2678640755</w:t>
+            </w:r>
+          </w:p>
           <w:p>
             <w:pPr>
               <w:jc w:val="center"/>
@@ -833,77 +773,60 @@
           <w:tcPr>
             <w:tcW w:w="4500" w:type="dxa"/>
           </w:tcPr>
-          <w:tbl>
-            <w:tblPr>
-              <w:tblW w:w="4300" w:type="dxa"/>
+          <w:p>
+            <w:pPr>
               <w:jc w:val="center"/>
-              <w:tblBorders>
-                <w:top w:val="single" w:sz="8" w:space="0" w:color="7F7F7F"/>
-                <w:left w:val="single" w:sz="8" w:space="0" w:color="7F7F7F"/>
-                <w:bottom w:val="single" w:sz="8" w:space="0" w:color="7F7F7F"/>
-                <w:right w:val="single" w:sz="8" w:space="0" w:color="7F7F7F"/>
-              </w:tblBorders>
-            </w:tblPr>
-            <w:tblGrid>
-              <w:gridCol w:w="4300"/>
-            </w:tblGrid>
-            <w:tr>
-              <w:tc>
-                <w:tcPr>
-                  <w:tcW w:w="4300" w:type="dxa"/>
-                  <w:shd w:val="clear" w:color="auto" w:fill="EDEDED"/>
-                </w:tcPr>
-                <w:p>
-                  <w:pPr>
-                    <w:jc w:val="both"/>
-                    <w:rPr>
-                      <w:rFonts w:ascii="Times New Roman" w:hAnsi="Times New Roman" w:cs="Times New Roman"/>
-                      <w:lang w:val="tr-TR"/>
-                    </w:rPr>
-                  </w:pPr>
-                  <w:r>
-                    <w:rPr>
-                      <w:rFonts w:ascii="Times New Roman" w:hAnsi="Times New Roman" w:cs="Times New Roman"/>
-                      <w:lang w:val="tr-TR"/>
-                    </w:rPr>
-                    <w:t xml:space="preserve">GÖRSEL ALANI (Shutterstock)</w:t>
-                  </w:r>
-                </w:p>
-                <w:p>
-                  <w:pPr>
-                    <w:jc w:val="both"/>
-                    <w:rPr>
-                      <w:rFonts w:ascii="Times New Roman" w:hAnsi="Times New Roman" w:cs="Times New Roman"/>
-                      <w:lang w:val="tr-TR"/>
-                    </w:rPr>
-                  </w:pPr>
-                  <w:r>
-                    <w:rPr>
-                      <w:rFonts w:ascii="Times New Roman" w:hAnsi="Times New Roman" w:cs="Times New Roman"/>
-                      <w:lang w:val="tr-TR"/>
-                    </w:rPr>
-                    <w:t xml:space="preserve">Tarif: Banyoda aynaya bakarak dişlerini fırçalayan bir çocuk.</w:t>
-                  </w:r>
-                </w:p>
-                <w:p>
-                  <w:pPr>
-                    <w:jc w:val="both"/>
-                    <w:rPr>
-                      <w:rFonts w:ascii="Times New Roman" w:hAnsi="Times New Roman" w:cs="Times New Roman"/>
-                      <w:lang w:val="tr-TR"/>
-                    </w:rPr>
-                  </w:pPr>
-                  <w:r>
-                    <w:rPr>
-                      <w:rFonts w:ascii="Times New Roman" w:hAnsi="Times New Roman" w:cs="Times New Roman"/>
-                      <w:lang w:val="tr-TR"/>
-                    </w:rPr>
-                    <w:t xml:space="preserve">Shutter ID: 2601219685 (fotoğraf) — Young boy brushing teeth in bathroom, smiling at reflection in mirror</w:t>
-                  </w:r>
-                </w:p>
-              </w:tc>
-            </w:tr>
-          </w:tbl>
+            </w:pPr>
+            <w:r>
+              <w:drawing>
+                <wp:inline xmlns:a="http://schemas.openxmlformats.org/drawingml/2006/main" xmlns:pic="http://schemas.openxmlformats.org/drawingml/2006/picture">
+                  <wp:extent cx="2664000" cy="1953600"/>
+                  <wp:docPr id="900017" name="Picture 900017"/>
+                  <wp:cNvGraphicFramePr>
+                    <a:graphicFrameLocks noChangeAspect="1"/>
+                  </wp:cNvGraphicFramePr>
+                  <a:graphic>
+                    <a:graphicData uri="http://schemas.openxmlformats.org/drawingml/2006/picture">
+                      <pic:pic>
+                        <pic:nvPicPr>
+                          <pic:cNvPr id="0" name="2601219685_d.jpg"/>
+                          <pic:cNvPicPr/>
+                        </pic:nvPicPr>
+                        <pic:blipFill>
+                          <a:blip r:embed="rId15"/>
+                          <a:stretch>
+                            <a:fillRect/>
+                          </a:stretch>
+                        </pic:blipFill>
+                        <pic:spPr>
+                          <a:xfrm>
+                            <a:off x="0" y="0"/>
+                            <a:ext cx="2664000" cy="1953600"/>
+                          </a:xfrm>
+                          <a:prstGeom prst="rect"/>
+                        </pic:spPr>
+                      </pic:pic>
+                    </a:graphicData>
+                  </a:graphic>
+                </wp:inline>
+              </w:drawing>
+            </w:r>
+          </w:p>
+          <w:p>
+            <w:pPr>
+              <w:jc w:val="center"/>
+            </w:pPr>
+            <w:r>
+              <w:rPr>
+                <w:rFonts w:ascii="Times New Roman" w:hAnsi="Times New Roman" w:cs="Times New Roman"/>
+                <w:b/>
+                <w:bCs/>
+                <w:highlight w:val="yellow"/>
+                <w:lang w:val="tr-TR"/>
+              </w:rPr>
+              <w:t xml:space="preserve">Shutter id: 2601219685</w:t>
+            </w:r>
+          </w:p>
           <w:p>
             <w:pPr>
               <w:jc w:val="center"/>

</xml_diff>

<commit_message>
2.13 Gorsel E: CaF2 cozunme modeli florit yapisinin dogru kesitiyle (F- kare orgu, Ca2+ dama duzeninde, 1:2) ve iyon yaricaplariyla yeniden cizildi; cozeltiye gecen iyonlar kristaldeki bosluklarla esitlendi
</commit_message>
<xml_diff>
--- a/Kim11-2-13-Cozunurluk-Carpimi.docx
+++ b/Kim11-2-13-Cozunurluk-Carpimi.docx
@@ -3429,7 +3429,7 @@
       <w:r>
         <w:drawing>
           <wp:inline distT="0" distB="0" distL="0" distR="0">
-            <wp:extent cx="5757683" cy="2697485"/>
+            <wp:extent cx="5398018" cy="2517653"/>
             <wp:docPr id="900003" name="Grafik 900003" descr="CaF2 çözünme süreç modeli"/>
             <wp:cNvGraphicFramePr>
               <a:graphicFrameLocks noChangeAspect="1"/>
@@ -3450,7 +3450,7 @@
                   <pic:spPr>
                     <a:xfrm>
                       <a:off x="0" y="0"/>
-                      <a:ext cx="5757683" cy="2697485"/>
+                      <a:ext cx="5398018" cy="2517653"/>
                     </a:xfrm>
                     <a:prstGeom prst="rect">
                       <a:avLst/>
@@ -3518,7 +3518,7 @@
           <w:highlight w:val="yellow"/>
           <w:lang w:val="tr-TR"/>
         </w:rPr>
-        <w:t xml:space="preserve">Taslak modeldir; yayınevi tarafından su moleküllerinin iyonları sardığı (hidratasyon) ayrıntı da eklenerek vektörel olarak yeniden çizilebilir.</w:t>
+        <w:t>Kristal, florit (CaF2) yapısının bir kesitiyle çizilmiştir: F− iyonları kare örgü oluşturur, Ca2+ iyonları karelerin dama düzenindeki merkezlerindedir (Ca2+ : F− = 1 : 2); iyon boyutları gerçek iyon yarıçaplarıyla orantılıdır. Görsel yeniden çizilirse bu düzen ve oran korunmalıdır.</w:t>
       </w:r>
     </w:p>
     <w:p>

</xml_diff>